<commit_message>
Update WBS 및 수행일지
초기 WBS 업로드, 수행일지 수정하였습니다.
</commit_message>
<xml_diff>
--- a/최종산출물/3. 수행일지/4월수행일지/[2조] 2026_04월_1주차_수행일지(현대이지웰_최종_프로젝트).docx
+++ b/최종산출물/3. 수행일지/4월수행일지/[2조] 2026_04월_1주차_수행일지(현대이지웰_최종_프로젝트).docx
@@ -14,7 +14,6 @@
           <w:szCs w:val="34"/>
         </w:rPr>
       </w:pPr>
-      <w:proofErr w:type="gramStart"/>
       <w:r>
         <w:rPr>
           <w:rFonts w:ascii="맑은 고딕" w:eastAsia="맑은 고딕" w:hAnsi="맑은 고딕" w:cs="맑은 고딕"/>
@@ -33,7 +32,6 @@
         </w:rPr>
         <w:t>4</w:t>
       </w:r>
-      <w:proofErr w:type="gramEnd"/>
       <w:r>
         <w:rPr>
           <w:rFonts w:ascii="맑은 고딕" w:eastAsia="맑은 고딕" w:hAnsi="맑은 고딕" w:cs="맑은 고딕"/>
@@ -59,27 +57,7 @@
           <w:sz w:val="34"/>
           <w:szCs w:val="34"/>
         </w:rPr>
-        <w:t xml:space="preserve">주차 프로젝트 수행 </w:t>
-      </w:r>
-      <w:proofErr w:type="gramStart"/>
-      <w:r>
-        <w:rPr>
-          <w:rFonts w:ascii="맑은 고딕" w:eastAsia="맑은 고딕" w:hAnsi="맑은 고딕" w:cs="맑은 고딕"/>
-          <w:b/>
-          <w:sz w:val="34"/>
-          <w:szCs w:val="34"/>
-        </w:rPr>
-        <w:t>일지 ]</w:t>
-      </w:r>
-      <w:proofErr w:type="gramEnd"/>
-      <w:r>
-        <w:rPr>
-          <w:rFonts w:ascii="맑은 고딕" w:eastAsia="맑은 고딕" w:hAnsi="맑은 고딕" w:cs="맑은 고딕"/>
-          <w:b/>
-          <w:sz w:val="34"/>
-          <w:szCs w:val="34"/>
-        </w:rPr>
-        <w:t xml:space="preserve"> </w:t>
+        <w:t xml:space="preserve">주차 프로젝트 수행 일지 ] </w:t>
       </w:r>
     </w:p>
     <w:p>
@@ -168,7 +146,7 @@
               <w:spacing w:line="240" w:lineRule="auto"/>
               <w:jc w:val="center"/>
               <w:rPr>
-                <w:rFonts w:ascii="맑은 고딕" w:eastAsia="맑은 고딕" w:hAnsi="맑은 고딕" w:cs="맑은 고딕" w:hint="eastAsia"/>
+                <w:rFonts w:ascii="맑은 고딕" w:eastAsia="맑은 고딕" w:hAnsi="맑은 고딕" w:cs="맑은 고딕"/>
                 <w:color w:val="B7B7B7"/>
                 <w:sz w:val="20"/>
                 <w:szCs w:val="20"/>
@@ -194,43 +172,7 @@
                 <w:sz w:val="20"/>
                 <w:szCs w:val="20"/>
               </w:rPr>
-              <w:t>(Data-</w:t>
-            </w:r>
-            <w:proofErr w:type="spellStart"/>
-            <w:r>
-              <w:rPr>
-                <w:rFonts w:ascii="맑은 고딕" w:eastAsia="맑은 고딕" w:hAnsi="맑은 고딕" w:cs="맑은 고딕"/>
-                <w:sz w:val="20"/>
-                <w:szCs w:val="20"/>
-              </w:rPr>
-              <w:t>To</w:t>
-            </w:r>
-            <w:proofErr w:type="spellEnd"/>
-            <w:r>
-              <w:rPr>
-                <w:rFonts w:ascii="맑은 고딕" w:eastAsia="맑은 고딕" w:hAnsi="맑은 고딕" w:cs="맑은 고딕"/>
-                <w:sz w:val="20"/>
-                <w:szCs w:val="20"/>
-              </w:rPr>
-              <w:t>-</w:t>
-            </w:r>
-            <w:proofErr w:type="spellStart"/>
-            <w:r>
-              <w:rPr>
-                <w:rFonts w:ascii="맑은 고딕" w:eastAsia="맑은 고딕" w:hAnsi="맑은 고딕" w:cs="맑은 고딕"/>
-                <w:sz w:val="20"/>
-                <w:szCs w:val="20"/>
-              </w:rPr>
-              <w:t>you</w:t>
-            </w:r>
-            <w:proofErr w:type="spellEnd"/>
-            <w:r>
-              <w:rPr>
-                <w:rFonts w:ascii="맑은 고딕" w:eastAsia="맑은 고딕" w:hAnsi="맑은 고딕" w:cs="맑은 고딕"/>
-                <w:sz w:val="20"/>
-                <w:szCs w:val="20"/>
-              </w:rPr>
-              <w:t>, 사용자를 향한 데이터)</w:t>
+              <w:t>(Data-To-you, 사용자를 향한 데이터)</w:t>
             </w:r>
           </w:p>
         </w:tc>
@@ -267,19 +209,8 @@
                 <w:sz w:val="20"/>
                 <w:szCs w:val="20"/>
               </w:rPr>
-              <w:t xml:space="preserve">프로젝트 </w:t>
-            </w:r>
-            <w:proofErr w:type="spellStart"/>
-            <w:r>
-              <w:rPr>
-                <w:rFonts w:ascii="맑은 고딕" w:eastAsia="맑은 고딕" w:hAnsi="맑은 고딕" w:cs="맑은 고딕"/>
-                <w:b/>
-                <w:sz w:val="20"/>
-                <w:szCs w:val="20"/>
-              </w:rPr>
-              <w:t>팀명</w:t>
-            </w:r>
-            <w:proofErr w:type="spellEnd"/>
+              <w:t>프로젝트 팀명</w:t>
+            </w:r>
           </w:p>
         </w:tc>
         <w:tc>
@@ -299,28 +230,17 @@
               <w:spacing w:line="240" w:lineRule="auto"/>
               <w:jc w:val="center"/>
               <w:rPr>
+                <w:sz w:val="23"/>
+                <w:szCs w:val="23"/>
+              </w:rPr>
+            </w:pPr>
+            <w:r>
+              <w:rPr>
                 <w:rFonts w:hint="eastAsia"/>
                 <w:sz w:val="23"/>
                 <w:szCs w:val="23"/>
               </w:rPr>
-            </w:pPr>
-            <w:proofErr w:type="spellStart"/>
-            <w:r>
-              <w:rPr>
-                <w:rFonts w:hint="eastAsia"/>
-                <w:sz w:val="23"/>
-                <w:szCs w:val="23"/>
-              </w:rPr>
-              <w:t>통모짜</w:t>
-            </w:r>
-            <w:proofErr w:type="spellEnd"/>
-            <w:r>
-              <w:rPr>
-                <w:rFonts w:hint="eastAsia"/>
-                <w:sz w:val="23"/>
-                <w:szCs w:val="23"/>
-              </w:rPr>
-              <w:t xml:space="preserve"> 개발자</w:t>
+              <w:t>통모짜 개발자</w:t>
             </w:r>
           </w:p>
         </w:tc>
@@ -415,43 +335,7 @@
                 <w:sz w:val="20"/>
                 <w:szCs w:val="20"/>
               </w:rPr>
-              <w:t xml:space="preserve"> </w:t>
-            </w:r>
-            <w:proofErr w:type="spellStart"/>
-            <w:r>
-              <w:rPr>
-                <w:rFonts w:ascii="맑은 고딕" w:eastAsia="맑은 고딕" w:hAnsi="맑은 고딕" w:cs="맑은 고딕" w:hint="eastAsia"/>
-                <w:sz w:val="20"/>
-                <w:szCs w:val="20"/>
-              </w:rPr>
-              <w:t>전이레</w:t>
-            </w:r>
-            <w:proofErr w:type="spellEnd"/>
-            <w:r>
-              <w:rPr>
-                <w:rFonts w:ascii="맑은 고딕" w:eastAsia="맑은 고딕" w:hAnsi="맑은 고딕" w:cs="맑은 고딕" w:hint="eastAsia"/>
-                <w:sz w:val="20"/>
-                <w:szCs w:val="20"/>
-              </w:rPr>
-              <w:t xml:space="preserve">, </w:t>
-            </w:r>
-            <w:proofErr w:type="spellStart"/>
-            <w:r>
-              <w:rPr>
-                <w:rFonts w:ascii="맑은 고딕" w:eastAsia="맑은 고딕" w:hAnsi="맑은 고딕" w:cs="맑은 고딕" w:hint="eastAsia"/>
-                <w:sz w:val="20"/>
-                <w:szCs w:val="20"/>
-              </w:rPr>
-              <w:t>정인혁</w:t>
-            </w:r>
-            <w:proofErr w:type="spellEnd"/>
-            <w:r>
-              <w:rPr>
-                <w:rFonts w:ascii="맑은 고딕" w:eastAsia="맑은 고딕" w:hAnsi="맑은 고딕" w:cs="맑은 고딕" w:hint="eastAsia"/>
-                <w:sz w:val="20"/>
-                <w:szCs w:val="20"/>
-              </w:rPr>
-              <w:t>, 김선철</w:t>
+              <w:t xml:space="preserve"> 전이레, 정인혁, 김선철</w:t>
             </w:r>
           </w:p>
         </w:tc>
@@ -883,69 +767,21 @@
                 <w:rFonts w:ascii="맑은 고딕" w:eastAsia="맑은 고딕" w:hAnsi="맑은 고딕" w:cs="맑은 고딕" w:hint="eastAsia"/>
                 <w:bCs/>
               </w:rPr>
-              <w:t xml:space="preserve">요구사항 정의서(담장: </w:t>
-            </w:r>
-            <w:proofErr w:type="spellStart"/>
-            <w:r>
-              <w:rPr>
-                <w:rFonts w:ascii="맑은 고딕" w:eastAsia="맑은 고딕" w:hAnsi="맑은 고딕" w:cs="맑은 고딕" w:hint="eastAsia"/>
-                <w:bCs/>
-              </w:rPr>
-              <w:t>전이레</w:t>
-            </w:r>
-            <w:proofErr w:type="spellEnd"/>
-            <w:r>
-              <w:rPr>
-                <w:rFonts w:ascii="맑은 고딕" w:eastAsia="맑은 고딕" w:hAnsi="맑은 고딕" w:cs="맑은 고딕" w:hint="eastAsia"/>
-                <w:bCs/>
-              </w:rPr>
-              <w:t xml:space="preserve">), </w:t>
-            </w:r>
-            <w:r>
-              <w:rPr>
-                <w:rFonts w:ascii="맑은 고딕" w:eastAsia="맑은 고딕" w:hAnsi="맑은 고딕" w:cs="맑은 고딕"/>
-                <w:bCs/>
-              </w:rPr>
-              <w:t xml:space="preserve">API </w:t>
-            </w:r>
-            <w:proofErr w:type="spellStart"/>
-            <w:r>
-              <w:rPr>
-                <w:rFonts w:ascii="맑은 고딕" w:eastAsia="맑은 고딕" w:hAnsi="맑은 고딕" w:cs="맑은 고딕"/>
-                <w:bCs/>
-              </w:rPr>
-              <w:t>엔드포인트</w:t>
-            </w:r>
-            <w:proofErr w:type="spellEnd"/>
-            <w:r>
-              <w:rPr>
-                <w:rFonts w:ascii="맑은 고딕" w:eastAsia="맑은 고딕" w:hAnsi="맑은 고딕" w:cs="맑은 고딕"/>
-                <w:bCs/>
-              </w:rPr>
-              <w:t xml:space="preserve"> 설계</w:t>
-            </w:r>
-            <w:r>
-              <w:rPr>
-                <w:rFonts w:ascii="맑은 고딕" w:eastAsia="맑은 고딕" w:hAnsi="맑은 고딕" w:cs="맑은 고딕" w:hint="eastAsia"/>
-                <w:bCs/>
-              </w:rPr>
-              <w:t>(담당: 이지수), DB ERD 설계(담당: 이지수)</w:t>
-            </w:r>
-            <w:proofErr w:type="spellStart"/>
-            <w:r>
-              <w:rPr>
-                <w:rFonts w:ascii="맑은 고딕" w:eastAsia="맑은 고딕" w:hAnsi="맑은 고딕" w:cs="맑은 고딕" w:hint="eastAsia"/>
-                <w:bCs/>
-              </w:rPr>
-              <w:t>를</w:t>
-            </w:r>
-            <w:proofErr w:type="spellEnd"/>
-            <w:r>
-              <w:rPr>
-                <w:rFonts w:ascii="맑은 고딕" w:eastAsia="맑은 고딕" w:hAnsi="맑은 고딕" w:cs="맑은 고딕" w:hint="eastAsia"/>
-                <w:bCs/>
-              </w:rPr>
-              <w:t xml:space="preserve"> 작성하였습니다.</w:t>
+              <w:t xml:space="preserve">요구사항 정의서(담장: 전이레), </w:t>
+            </w:r>
+            <w:r>
+              <w:rPr>
+                <w:rFonts w:ascii="맑은 고딕" w:eastAsia="맑은 고딕" w:hAnsi="맑은 고딕" w:cs="맑은 고딕"/>
+                <w:bCs/>
+              </w:rPr>
+              <w:t>API 엔드포인트 설계</w:t>
+            </w:r>
+            <w:r>
+              <w:rPr>
+                <w:rFonts w:ascii="맑은 고딕" w:eastAsia="맑은 고딕" w:hAnsi="맑은 고딕" w:cs="맑은 고딕" w:hint="eastAsia"/>
+                <w:bCs/>
+              </w:rPr>
+              <w:t>(담당: 이지수), DB ERD 설계(담당: 이지수)를 작성하였습니다.</w:t>
             </w:r>
           </w:p>
           <w:p>
@@ -968,23 +804,7 @@
                 <w:bCs/>
               </w:rPr>
               <w:lastRenderedPageBreak/>
-              <w:t>요구사항 정의서에서 정책(</w:t>
-            </w:r>
-            <w:proofErr w:type="spellStart"/>
-            <w:r>
-              <w:rPr>
-                <w:rFonts w:ascii="맑은 고딕" w:eastAsia="맑은 고딕" w:hAnsi="맑은 고딕" w:cs="맑은 고딕" w:hint="eastAsia"/>
-                <w:bCs/>
-              </w:rPr>
-              <w:t>Policy</w:t>
-            </w:r>
-            <w:proofErr w:type="spellEnd"/>
-            <w:r>
-              <w:rPr>
-                <w:rFonts w:ascii="맑은 고딕" w:eastAsia="맑은 고딕" w:hAnsi="맑은 고딕" w:cs="맑은 고딕" w:hint="eastAsia"/>
-                <w:bCs/>
-              </w:rPr>
-              <w:t>)을 회의를 통하여 결정하였습니다.</w:t>
+              <w:t>요구사항 정의서에서 정책(Policy)을 회의를 통하여 결정하였습니다.</w:t>
             </w:r>
           </w:p>
           <w:p>
@@ -1006,87 +826,7 @@
                 <w:rFonts w:ascii="맑은 고딕" w:eastAsia="맑은 고딕" w:hAnsi="맑은 고딕" w:cs="맑은 고딕" w:hint="eastAsia"/>
                 <w:bCs/>
               </w:rPr>
-              <w:t xml:space="preserve">벤치마킹(레퍼런스) </w:t>
-            </w:r>
-            <w:proofErr w:type="spellStart"/>
-            <w:r>
-              <w:rPr>
-                <w:rFonts w:ascii="맑은 고딕" w:eastAsia="맑은 고딕" w:hAnsi="맑은 고딕" w:cs="맑은 고딕" w:hint="eastAsia"/>
-                <w:bCs/>
-              </w:rPr>
-              <w:t>리서칭을</w:t>
-            </w:r>
-            <w:proofErr w:type="spellEnd"/>
-            <w:r>
-              <w:rPr>
-                <w:rFonts w:ascii="맑은 고딕" w:eastAsia="맑은 고딕" w:hAnsi="맑은 고딕" w:cs="맑은 고딕" w:hint="eastAsia"/>
-                <w:bCs/>
-              </w:rPr>
-              <w:t xml:space="preserve"> 진행했습니다(담당자: 김선철, </w:t>
-            </w:r>
-            <w:proofErr w:type="spellStart"/>
-            <w:r>
-              <w:rPr>
-                <w:rFonts w:ascii="맑은 고딕" w:eastAsia="맑은 고딕" w:hAnsi="맑은 고딕" w:cs="맑은 고딕" w:hint="eastAsia"/>
-                <w:bCs/>
-              </w:rPr>
-              <w:t>정인혁</w:t>
-            </w:r>
-            <w:proofErr w:type="spellEnd"/>
-            <w:r>
-              <w:rPr>
-                <w:rFonts w:ascii="맑은 고딕" w:eastAsia="맑은 고딕" w:hAnsi="맑은 고딕" w:cs="맑은 고딕" w:hint="eastAsia"/>
-                <w:bCs/>
-              </w:rPr>
-              <w:t xml:space="preserve">). 벤치마킹 리서치의 결과 </w:t>
-            </w:r>
-            <w:proofErr w:type="spellStart"/>
-            <w:r>
-              <w:rPr>
-                <w:rFonts w:ascii="맑은 고딕" w:eastAsia="맑은 고딕" w:hAnsi="맑은 고딕" w:cs="맑은 고딕" w:hint="eastAsia"/>
-                <w:bCs/>
-              </w:rPr>
-              <w:t>쿠팡</w:t>
-            </w:r>
-            <w:proofErr w:type="spellEnd"/>
-            <w:r>
-              <w:rPr>
-                <w:rFonts w:ascii="맑은 고딕" w:eastAsia="맑은 고딕" w:hAnsi="맑은 고딕" w:cs="맑은 고딕" w:hint="eastAsia"/>
-                <w:bCs/>
-              </w:rPr>
-              <w:t xml:space="preserve"> 및 </w:t>
-            </w:r>
-            <w:proofErr w:type="spellStart"/>
-            <w:r>
-              <w:rPr>
-                <w:rFonts w:ascii="맑은 고딕" w:eastAsia="맑은 고딕" w:hAnsi="맑은 고딕" w:cs="맑은 고딕" w:hint="eastAsia"/>
-                <w:bCs/>
-              </w:rPr>
-              <w:t>테무</w:t>
-            </w:r>
-            <w:proofErr w:type="spellEnd"/>
-            <w:r>
-              <w:rPr>
-                <w:rFonts w:ascii="맑은 고딕" w:eastAsia="맑은 고딕" w:hAnsi="맑은 고딕" w:cs="맑은 고딕" w:hint="eastAsia"/>
-                <w:bCs/>
-              </w:rPr>
-              <w:t xml:space="preserve">, 그리고 </w:t>
-            </w:r>
-            <w:proofErr w:type="spellStart"/>
-            <w:r>
-              <w:rPr>
-                <w:rFonts w:ascii="맑은 고딕" w:eastAsia="맑은 고딕" w:hAnsi="맑은 고딕" w:cs="맑은 고딕" w:hint="eastAsia"/>
-                <w:bCs/>
-              </w:rPr>
-              <w:t>lifepick의</w:t>
-            </w:r>
-            <w:proofErr w:type="spellEnd"/>
-            <w:r>
-              <w:rPr>
-                <w:rFonts w:ascii="맑은 고딕" w:eastAsia="맑은 고딕" w:hAnsi="맑은 고딕" w:cs="맑은 고딕" w:hint="eastAsia"/>
-                <w:bCs/>
-              </w:rPr>
-              <w:t xml:space="preserve"> 구성 스타일을 절충하여 사용하기로 결정하였습니다.</w:t>
+              <w:t>벤치마킹(레퍼런스) 리서칭을 진행했습니다(담당자: 김선철, 정인혁). 벤치마킹 리서치의 결과 쿠팡 및 테무, 그리고 lifepick의 구성 스타일을 절충하여 사용하기로 결정하였습니다.</w:t>
             </w:r>
           </w:p>
           <w:p>
@@ -1152,23 +892,7 @@
                 <w:rFonts w:ascii="맑은 고딕" w:eastAsia="맑은 고딕" w:hAnsi="맑은 고딕" w:cs="맑은 고딕" w:hint="eastAsia"/>
                 <w:bCs/>
               </w:rPr>
-              <w:t xml:space="preserve">상품 및 </w:t>
-            </w:r>
-            <w:proofErr w:type="spellStart"/>
-            <w:r>
-              <w:rPr>
-                <w:rFonts w:ascii="맑은 고딕" w:eastAsia="맑은 고딕" w:hAnsi="맑은 고딕" w:cs="맑은 고딕" w:hint="eastAsia"/>
-                <w:bCs/>
-              </w:rPr>
-              <w:t>이커머스</w:t>
-            </w:r>
-            <w:proofErr w:type="spellEnd"/>
-            <w:r>
-              <w:rPr>
-                <w:rFonts w:ascii="맑은 고딕" w:eastAsia="맑은 고딕" w:hAnsi="맑은 고딕" w:cs="맑은 고딕" w:hint="eastAsia"/>
-                <w:bCs/>
-              </w:rPr>
-              <w:t xml:space="preserve"> </w:t>
+              <w:t xml:space="preserve">상품 및 이커머스 </w:t>
             </w:r>
             <w:r>
               <w:rPr>
@@ -1182,17 +906,8 @@
                 <w:rFonts w:ascii="맑은 고딕" w:eastAsia="맑은 고딕" w:hAnsi="맑은 고딕" w:cs="맑은 고딕" w:hint="eastAsia"/>
                 <w:bCs/>
               </w:rPr>
-              <w:t xml:space="preserve">: </w:t>
-            </w:r>
-            <w:proofErr w:type="spellStart"/>
-            <w:r>
-              <w:rPr>
-                <w:rFonts w:ascii="맑은 고딕" w:eastAsia="맑은 고딕" w:hAnsi="맑은 고딕" w:cs="맑은 고딕" w:hint="eastAsia"/>
-                <w:bCs/>
-              </w:rPr>
-              <w:t>정인혁</w:t>
-            </w:r>
-            <w:proofErr w:type="spellEnd"/>
+              <w:t>: 정인혁</w:t>
+            </w:r>
           </w:p>
           <w:p>
             <w:pPr>
@@ -1227,17 +942,8 @@
                 <w:rFonts w:ascii="맑은 고딕" w:eastAsia="맑은 고딕" w:hAnsi="맑은 고딕" w:cs="맑은 고딕" w:hint="eastAsia"/>
                 <w:bCs/>
               </w:rPr>
-              <w:t xml:space="preserve">: </w:t>
-            </w:r>
-            <w:proofErr w:type="spellStart"/>
-            <w:r>
-              <w:rPr>
-                <w:rFonts w:ascii="맑은 고딕" w:eastAsia="맑은 고딕" w:hAnsi="맑은 고딕" w:cs="맑은 고딕" w:hint="eastAsia"/>
-                <w:bCs/>
-              </w:rPr>
-              <w:t>전이레</w:t>
-            </w:r>
-            <w:proofErr w:type="spellEnd"/>
+              <w:t>: 전이레</w:t>
+            </w:r>
           </w:p>
           <w:p>
             <w:pPr>
@@ -1294,23 +1000,7 @@
                 <w:rFonts w:ascii="맑은 고딕" w:eastAsia="맑은 고딕" w:hAnsi="맑은 고딕" w:cs="맑은 고딕" w:hint="eastAsia"/>
                 <w:bCs/>
               </w:rPr>
-              <w:t xml:space="preserve">사이트 맵 생성(담당자: </w:t>
-            </w:r>
-            <w:proofErr w:type="spellStart"/>
-            <w:r>
-              <w:rPr>
-                <w:rFonts w:ascii="맑은 고딕" w:eastAsia="맑은 고딕" w:hAnsi="맑은 고딕" w:cs="맑은 고딕" w:hint="eastAsia"/>
-                <w:bCs/>
-              </w:rPr>
-              <w:t>정인혁</w:t>
-            </w:r>
-            <w:proofErr w:type="spellEnd"/>
-            <w:r>
-              <w:rPr>
-                <w:rFonts w:ascii="맑은 고딕" w:eastAsia="맑은 고딕" w:hAnsi="맑은 고딕" w:cs="맑은 고딕" w:hint="eastAsia"/>
-                <w:bCs/>
-              </w:rPr>
-              <w:t>)을 하였습니다.</w:t>
+              <w:t>사이트 맵 생성(담당자: 정인혁)을 하였습니다.</w:t>
             </w:r>
           </w:p>
           <w:p>
@@ -1368,39 +1058,7 @@
                 <w:rFonts w:ascii="맑은 고딕" w:eastAsia="맑은 고딕" w:hAnsi="맑은 고딕" w:cs="맑은 고딕" w:hint="eastAsia"/>
                 <w:bCs/>
               </w:rPr>
-              <w:t xml:space="preserve">작성(담당자: </w:t>
-            </w:r>
-            <w:proofErr w:type="spellStart"/>
-            <w:r>
-              <w:rPr>
-                <w:rFonts w:ascii="맑은 고딕" w:eastAsia="맑은 고딕" w:hAnsi="맑은 고딕" w:cs="맑은 고딕" w:hint="eastAsia"/>
-                <w:bCs/>
-              </w:rPr>
-              <w:t>전이레</w:t>
-            </w:r>
-            <w:proofErr w:type="spellEnd"/>
-            <w:r>
-              <w:rPr>
-                <w:rFonts w:ascii="맑은 고딕" w:eastAsia="맑은 고딕" w:hAnsi="맑은 고딕" w:cs="맑은 고딕" w:hint="eastAsia"/>
-                <w:bCs/>
-              </w:rPr>
-              <w:t xml:space="preserve">) 및 WBS 작성(담당자: </w:t>
-            </w:r>
-            <w:proofErr w:type="spellStart"/>
-            <w:r>
-              <w:rPr>
-                <w:rFonts w:ascii="맑은 고딕" w:eastAsia="맑은 고딕" w:hAnsi="맑은 고딕" w:cs="맑은 고딕" w:hint="eastAsia"/>
-                <w:bCs/>
-              </w:rPr>
-              <w:t>전이레</w:t>
-            </w:r>
-            <w:proofErr w:type="spellEnd"/>
-            <w:r>
-              <w:rPr>
-                <w:rFonts w:ascii="맑은 고딕" w:eastAsia="맑은 고딕" w:hAnsi="맑은 고딕" w:cs="맑은 고딕" w:hint="eastAsia"/>
-                <w:bCs/>
-              </w:rPr>
-              <w:t>)을 하였습니다.</w:t>
+              <w:t>작성(담당자: 전이레) 및 WBS 작성(담당자: 전이레)을 하였습니다.</w:t>
             </w:r>
           </w:p>
           <w:p>
@@ -1413,73 +1071,16 @@
               <w:spacing w:before="240" w:after="240"/>
               <w:ind w:leftChars="0"/>
               <w:rPr>
-                <w:rFonts w:ascii="맑은 고딕" w:eastAsia="맑은 고딕" w:hAnsi="맑은 고딕" w:cs="맑은 고딕" w:hint="eastAsia"/>
+                <w:rFonts w:ascii="맑은 고딕" w:eastAsia="맑은 고딕" w:hAnsi="맑은 고딕" w:cs="맑은 고딕"/>
                 <w:bCs/>
               </w:rPr>
             </w:pPr>
-            <w:proofErr w:type="spellStart"/>
-            <w:r>
-              <w:rPr>
-                <w:rFonts w:ascii="맑은 고딕" w:eastAsia="맑은 고딕" w:hAnsi="맑은 고딕" w:cs="맑은 고딕" w:hint="eastAsia"/>
-                <w:bCs/>
-              </w:rPr>
-              <w:t>깃허브</w:t>
-            </w:r>
-            <w:proofErr w:type="spellEnd"/>
-            <w:r>
-              <w:rPr>
-                <w:rFonts w:ascii="맑은 고딕" w:eastAsia="맑은 고딕" w:hAnsi="맑은 고딕" w:cs="맑은 고딕" w:hint="eastAsia"/>
-                <w:bCs/>
-              </w:rPr>
-              <w:t xml:space="preserve"> 규칙(</w:t>
-            </w:r>
-            <w:proofErr w:type="spellStart"/>
-            <w:r>
-              <w:rPr>
-                <w:rFonts w:ascii="맑은 고딕" w:eastAsia="맑은 고딕" w:hAnsi="맑은 고딕" w:cs="맑은 고딕" w:hint="eastAsia"/>
-                <w:bCs/>
-              </w:rPr>
-              <w:t>브랜치</w:t>
-            </w:r>
-            <w:proofErr w:type="spellEnd"/>
-            <w:r>
-              <w:rPr>
-                <w:rFonts w:ascii="맑은 고딕" w:eastAsia="맑은 고딕" w:hAnsi="맑은 고딕" w:cs="맑은 고딕" w:hint="eastAsia"/>
-                <w:bCs/>
-              </w:rPr>
-              <w:t>/</w:t>
-            </w:r>
-            <w:proofErr w:type="spellStart"/>
-            <w:r>
-              <w:rPr>
-                <w:rFonts w:ascii="맑은 고딕" w:eastAsia="맑은 고딕" w:hAnsi="맑은 고딕" w:cs="맑은 고딕" w:hint="eastAsia"/>
-                <w:bCs/>
-              </w:rPr>
-              <w:t>커밋</w:t>
-            </w:r>
-            <w:proofErr w:type="spellEnd"/>
-            <w:r>
-              <w:rPr>
-                <w:rFonts w:ascii="맑은 고딕" w:eastAsia="맑은 고딕" w:hAnsi="맑은 고딕" w:cs="맑은 고딕" w:hint="eastAsia"/>
-                <w:bCs/>
-              </w:rPr>
-              <w:t xml:space="preserve"> 메시지)을 </w:t>
-            </w:r>
-            <w:proofErr w:type="spellStart"/>
-            <w:r>
-              <w:rPr>
-                <w:rFonts w:ascii="맑은 고딕" w:eastAsia="맑은 고딕" w:hAnsi="맑은 고딕" w:cs="맑은 고딕" w:hint="eastAsia"/>
-                <w:bCs/>
-              </w:rPr>
-              <w:t>정해두었습니다</w:t>
-            </w:r>
-            <w:proofErr w:type="spellEnd"/>
-            <w:r>
-              <w:rPr>
-                <w:rFonts w:ascii="맑은 고딕" w:eastAsia="맑은 고딕" w:hAnsi="맑은 고딕" w:cs="맑은 고딕" w:hint="eastAsia"/>
-                <w:bCs/>
-              </w:rPr>
-              <w:t>.</w:t>
+            <w:r>
+              <w:rPr>
+                <w:rFonts w:ascii="맑은 고딕" w:eastAsia="맑은 고딕" w:hAnsi="맑은 고딕" w:cs="맑은 고딕" w:hint="eastAsia"/>
+                <w:bCs/>
+              </w:rPr>
+              <w:t>깃허브 규칙(브랜치/커밋 메시지)을 정해두었습니다.</w:t>
             </w:r>
           </w:p>
         </w:tc>
@@ -1530,21 +1131,12 @@
                 <w:bCs/>
               </w:rPr>
             </w:pPr>
-            <w:proofErr w:type="spellStart"/>
-            <w:r>
-              <w:rPr>
-                <w:rFonts w:ascii="맑은 고딕" w:eastAsia="맑은 고딕" w:hAnsi="맑은 고딕" w:cs="맑은 고딕" w:hint="eastAsia"/>
-                <w:bCs/>
-              </w:rPr>
-              <w:t>엔드포인트</w:t>
-            </w:r>
-            <w:proofErr w:type="spellEnd"/>
-            <w:r>
-              <w:rPr>
-                <w:rFonts w:ascii="맑은 고딕" w:eastAsia="맑은 고딕" w:hAnsi="맑은 고딕" w:cs="맑은 고딕" w:hint="eastAsia"/>
-                <w:bCs/>
-              </w:rPr>
-              <w:t xml:space="preserve"> 확정</w:t>
+            <w:r>
+              <w:rPr>
+                <w:rFonts w:ascii="맑은 고딕" w:eastAsia="맑은 고딕" w:hAnsi="맑은 고딕" w:cs="맑은 고딕" w:hint="eastAsia"/>
+                <w:bCs/>
+              </w:rPr>
+              <w:t>엔드포인트 확정</w:t>
             </w:r>
           </w:p>
           <w:p>
@@ -1566,37 +1158,7 @@
                 <w:rFonts w:ascii="맑은 고딕" w:eastAsia="맑은 고딕" w:hAnsi="맑은 고딕" w:cs="맑은 고딕" w:hint="eastAsia"/>
                 <w:bCs/>
               </w:rPr>
-              <w:t>[</w:t>
-            </w:r>
-            <w:proofErr w:type="spellStart"/>
-            <w:r>
-              <w:rPr>
-                <w:rFonts w:ascii="맑은 고딕" w:eastAsia="맑은 고딕" w:hAnsi="맑은 고딕" w:cs="맑은 고딕" w:hint="eastAsia"/>
-                <w:bCs/>
-              </w:rPr>
-              <w:t>백엔드</w:t>
-            </w:r>
-            <w:proofErr w:type="spellEnd"/>
-            <w:r>
-              <w:rPr>
-                <w:rFonts w:ascii="맑은 고딕" w:eastAsia="맑은 고딕" w:hAnsi="맑은 고딕" w:cs="맑은 고딕" w:hint="eastAsia"/>
-                <w:bCs/>
-              </w:rPr>
-              <w:t xml:space="preserve">] </w:t>
-            </w:r>
-            <w:r>
-              <w:rPr>
-                <w:rFonts w:ascii="맑은 고딕" w:eastAsia="맑은 고딕" w:hAnsi="맑은 고딕" w:cs="맑은 고딕" w:hint="eastAsia"/>
-                <w:bCs/>
-              </w:rPr>
-              <w:t>ERD 설계 확정</w:t>
-            </w:r>
-            <w:r>
-              <w:rPr>
-                <w:rFonts w:ascii="맑은 고딕" w:eastAsia="맑은 고딕" w:hAnsi="맑은 고딕" w:cs="맑은 고딕" w:hint="eastAsia"/>
-                <w:bCs/>
-              </w:rPr>
-              <w:t xml:space="preserve">, </w:t>
+              <w:t xml:space="preserve">[백엔드] ERD 설계 확정, </w:t>
             </w:r>
             <w:r>
               <w:rPr>
@@ -1625,23 +1187,7 @@
                 <w:rFonts w:ascii="맑은 고딕" w:eastAsia="맑은 고딕" w:hAnsi="맑은 고딕" w:cs="맑은 고딕" w:hint="eastAsia"/>
                 <w:bCs/>
               </w:rPr>
-              <w:t>[</w:t>
-            </w:r>
-            <w:proofErr w:type="spellStart"/>
-            <w:r>
-              <w:rPr>
-                <w:rFonts w:ascii="맑은 고딕" w:eastAsia="맑은 고딕" w:hAnsi="맑은 고딕" w:cs="맑은 고딕" w:hint="eastAsia"/>
-                <w:bCs/>
-              </w:rPr>
-              <w:t>백엔드</w:t>
-            </w:r>
-            <w:proofErr w:type="spellEnd"/>
-            <w:r>
-              <w:rPr>
-                <w:rFonts w:ascii="맑은 고딕" w:eastAsia="맑은 고딕" w:hAnsi="맑은 고딕" w:cs="맑은 고딕" w:hint="eastAsia"/>
-                <w:bCs/>
-              </w:rPr>
-              <w:t xml:space="preserve">] </w:t>
+              <w:t xml:space="preserve">[백엔드] </w:t>
             </w:r>
             <w:r>
               <w:rPr>
@@ -1670,78 +1216,14 @@
                 <w:rFonts w:ascii="맑은 고딕" w:eastAsia="맑은 고딕" w:hAnsi="맑은 고딕" w:cs="맑은 고딕" w:hint="eastAsia"/>
                 <w:bCs/>
               </w:rPr>
-              <w:t>[</w:t>
-            </w:r>
-            <w:proofErr w:type="spellStart"/>
-            <w:r>
-              <w:rPr>
-                <w:rFonts w:ascii="맑은 고딕" w:eastAsia="맑은 고딕" w:hAnsi="맑은 고딕" w:cs="맑은 고딕" w:hint="eastAsia"/>
-                <w:bCs/>
-              </w:rPr>
-              <w:t>프런트엔드</w:t>
-            </w:r>
-            <w:proofErr w:type="spellEnd"/>
-            <w:r>
-              <w:rPr>
-                <w:rFonts w:ascii="맑은 고딕" w:eastAsia="맑은 고딕" w:hAnsi="맑은 고딕" w:cs="맑은 고딕" w:hint="eastAsia"/>
-                <w:bCs/>
-              </w:rPr>
-              <w:t xml:space="preserve">] </w:t>
-            </w:r>
-            <w:r>
-              <w:rPr>
-                <w:rFonts w:ascii="맑은 고딕" w:eastAsia="맑은 고딕" w:hAnsi="맑은 고딕" w:cs="맑은 고딕"/>
-                <w:bCs/>
-              </w:rPr>
-              <w:t xml:space="preserve">공통 </w:t>
-            </w:r>
-            <w:proofErr w:type="spellStart"/>
-            <w:r>
-              <w:rPr>
-                <w:rFonts w:ascii="맑은 고딕" w:eastAsia="맑은 고딕" w:hAnsi="맑은 고딕" w:cs="맑은 고딕"/>
-                <w:bCs/>
-              </w:rPr>
-              <w:t>컴포넌트Header</w:t>
-            </w:r>
-            <w:proofErr w:type="spellEnd"/>
-            <w:r>
-              <w:rPr>
-                <w:rFonts w:ascii="맑은 고딕" w:eastAsia="맑은 고딕" w:hAnsi="맑은 고딕" w:cs="맑은 고딕"/>
-                <w:bCs/>
-              </w:rPr>
-              <w:t xml:space="preserve">, </w:t>
-            </w:r>
-            <w:proofErr w:type="spellStart"/>
-            <w:r>
-              <w:rPr>
-                <w:rFonts w:ascii="맑은 고딕" w:eastAsia="맑은 고딕" w:hAnsi="맑은 고딕" w:cs="맑은 고딕"/>
-                <w:bCs/>
-              </w:rPr>
-              <w:t>Footer</w:t>
-            </w:r>
-            <w:proofErr w:type="spellEnd"/>
-            <w:r>
-              <w:rPr>
-                <w:rFonts w:ascii="맑은 고딕" w:eastAsia="맑은 고딕" w:hAnsi="맑은 고딕" w:cs="맑은 고딕"/>
-                <w:bCs/>
-              </w:rPr>
-              <w:t xml:space="preserve">, </w:t>
-            </w:r>
-            <w:proofErr w:type="spellStart"/>
-            <w:r>
-              <w:rPr>
-                <w:rFonts w:ascii="맑은 고딕" w:eastAsia="맑은 고딕" w:hAnsi="맑은 고딕" w:cs="맑은 고딕"/>
-                <w:bCs/>
-              </w:rPr>
-              <w:t>Button</w:t>
-            </w:r>
-            <w:proofErr w:type="spellEnd"/>
-            <w:r>
-              <w:rPr>
-                <w:rFonts w:ascii="맑은 고딕" w:eastAsia="맑은 고딕" w:hAnsi="맑은 고딕" w:cs="맑은 고딕"/>
-                <w:bCs/>
-              </w:rPr>
-              <w:t xml:space="preserve"> 제작 및 라우팅 환경 설정</w:t>
+              <w:t xml:space="preserve">[프런트엔드] </w:t>
+            </w:r>
+            <w:r>
+              <w:rPr>
+                <w:rFonts w:ascii="맑은 고딕" w:eastAsia="맑은 고딕" w:hAnsi="맑은 고딕" w:cs="맑은 고딕"/>
+                <w:bCs/>
+              </w:rPr>
+              <w:t>공통 컴포넌트Header, Footer, Button 제작 및 라우팅 환경 설정</w:t>
             </w:r>
           </w:p>
           <w:p>
@@ -1754,7 +1236,7 @@
               <w:spacing w:before="240" w:after="240"/>
               <w:ind w:leftChars="0"/>
               <w:rPr>
-                <w:rFonts w:ascii="맑은 고딕" w:eastAsia="맑은 고딕" w:hAnsi="맑은 고딕" w:cs="맑은 고딕" w:hint="eastAsia"/>
+                <w:rFonts w:ascii="맑은 고딕" w:eastAsia="맑은 고딕" w:hAnsi="맑은 고딕" w:cs="맑은 고딕"/>
                 <w:bCs/>
               </w:rPr>
             </w:pPr>
@@ -1771,6 +1253,50 @@
                 <w:bCs/>
               </w:rPr>
               <w:t>의 프로토타입 퍼블리싱</w:t>
+            </w:r>
+          </w:p>
+          <w:p>
+            <w:pPr>
+              <w:pStyle w:val="affffffb"/>
+              <w:numPr>
+                <w:ilvl w:val="0"/>
+                <w:numId w:val="1"/>
+              </w:numPr>
+              <w:spacing w:before="240" w:after="240"/>
+              <w:ind w:leftChars="0"/>
+              <w:rPr>
+                <w:rFonts w:ascii="맑은 고딕" w:eastAsia="맑은 고딕" w:hAnsi="맑은 고딕" w:cs="맑은 고딕"/>
+                <w:bCs/>
+              </w:rPr>
+            </w:pPr>
+            <w:r>
+              <w:rPr>
+                <w:rFonts w:ascii="맑은 고딕" w:eastAsia="맑은 고딕" w:hAnsi="맑은 고딕" w:cs="맑은 고딕"/>
+                <w:bCs/>
+              </w:rPr>
+              <w:t>접근성 체크리스트 적용 기준 수립</w:t>
+            </w:r>
+          </w:p>
+          <w:p>
+            <w:pPr>
+              <w:pStyle w:val="affffffb"/>
+              <w:numPr>
+                <w:ilvl w:val="0"/>
+                <w:numId w:val="1"/>
+              </w:numPr>
+              <w:spacing w:before="240" w:after="240"/>
+              <w:ind w:leftChars="0"/>
+              <w:rPr>
+                <w:rFonts w:ascii="맑은 고딕" w:eastAsia="맑은 고딕" w:hAnsi="맑은 고딕" w:cs="맑은 고딕"/>
+                <w:bCs/>
+              </w:rPr>
+            </w:pPr>
+            <w:r>
+              <w:rPr>
+                <w:rFonts w:ascii="맑은 고딕" w:eastAsia="맑은 고딕" w:hAnsi="맑은 고딕" w:cs="맑은 고딕" w:hint="eastAsia"/>
+                <w:bCs/>
+              </w:rPr>
+              <w:t>발표자 및 PPT 제작자 결정</w:t>
             </w:r>
           </w:p>
         </w:tc>
@@ -1845,7 +1371,7 @@
             <w:pPr>
               <w:spacing w:before="240" w:after="240"/>
               <w:rPr>
-                <w:rFonts w:ascii="맑은 고딕" w:eastAsia="맑은 고딕" w:hAnsi="맑은 고딕" w:cs="맑은 고딕" w:hint="eastAsia"/>
+                <w:rFonts w:ascii="맑은 고딕" w:eastAsia="맑은 고딕" w:hAnsi="맑은 고딕" w:cs="맑은 고딕"/>
                 <w:bCs/>
               </w:rPr>
             </w:pPr>
@@ -1879,6 +1405,56 @@
     </w:sectPr>
   </w:body>
 </w:document>
+</file>
+
+<file path=word/endnotes.xml><?xml version="1.0" encoding="utf-8"?>
+<w:endnotes xmlns:wpc="http://schemas.microsoft.com/office/word/2010/wordprocessingCanvas" xmlns:cx="http://schemas.microsoft.com/office/drawing/2014/chartex" xmlns:cx1="http://schemas.microsoft.com/office/drawing/2015/9/8/chartex" xmlns:cx2="http://schemas.microsoft.com/office/drawing/2015/10/21/chartex" xmlns:cx3="http://schemas.microsoft.com/office/drawing/2016/5/9/chartex" xmlns:cx4="http://schemas.microsoft.com/office/drawing/2016/5/10/chartex" xmlns:cx5="http://schemas.microsoft.com/office/drawing/2016/5/11/chartex" xmlns:cx6="http://schemas.microsoft.com/office/drawing/2016/5/12/chartex" xmlns:cx7="http://schemas.microsoft.com/office/drawing/2016/5/13/chartex" xmlns:cx8="http://schemas.microsoft.com/office/drawing/2016/5/14/chartex" xmlns:mc="http://schemas.openxmlformats.org/markup-compatibility/2006" xmlns:aink="http://schemas.microsoft.com/office/drawing/2016/ink" xmlns:am3d="http://schemas.microsoft.com/office/drawing/2017/model3d" xmlns:o="urn:schemas-microsoft-com:office:office" xmlns:oel="http://schemas.microsoft.com/office/2019/extlst" xmlns:r="http://schemas.openxmlformats.org/officeDocument/2006/relationships" xmlns:m="http://schemas.openxmlformats.org/officeDocument/2006/math" xmlns:v="urn:schemas-microsoft-com:vml" xmlns:wp14="http://schemas.microsoft.com/office/word/2010/wordprocessingDrawing" xmlns:wp="http://schemas.openxmlformats.org/drawingml/2006/wordprocessingDrawing" xmlns:w10="urn:schemas-microsoft-com:office:word" xmlns:w="http://schemas.openxmlformats.org/wordprocessingml/2006/main" xmlns:w14="http://schemas.microsoft.com/office/word/2010/wordml" xmlns:w15="http://schemas.microsoft.com/office/word/2012/wordml" xmlns:w16cex="http://schemas.microsoft.com/office/word/2018/wordml/cex" xmlns:w16cid="http://schemas.microsoft.com/office/word/2016/wordml/cid" xmlns:w16="http://schemas.microsoft.com/office/word/2018/wordml" xmlns:w16du="http://schemas.microsoft.com/office/word/2023/wordml/word16du" xmlns:w16sdtdh="http://schemas.microsoft.com/office/word/2020/wordml/sdtdatahash" xmlns:w16sdtfl="http://schemas.microsoft.com/office/word/2024/wordml/sdtformatlock" xmlns:w16se="http://schemas.microsoft.com/office/word/2015/wordml/symex" xmlns:wpg="http://schemas.microsoft.com/office/word/2010/wordprocessingGroup" xmlns:wpi="http://schemas.microsoft.com/office/word/2010/wordprocessingInk" xmlns:wne="http://schemas.microsoft.com/office/word/2006/wordml" xmlns:wps="http://schemas.microsoft.com/office/word/2010/wordprocessingShape" mc:Ignorable="w14 w15 w16se w16cid w16 w16cex w16sdtdh w16sdtfl w16du wp14">
+  <w:endnote w:type="separator" w:id="-1">
+    <w:p>
+      <w:pPr>
+        <w:spacing w:line="240" w:lineRule="auto"/>
+      </w:pPr>
+      <w:r>
+        <w:separator/>
+      </w:r>
+    </w:p>
+  </w:endnote>
+  <w:endnote w:type="continuationSeparator" w:id="0">
+    <w:p>
+      <w:pPr>
+        <w:spacing w:line="240" w:lineRule="auto"/>
+      </w:pPr>
+      <w:r>
+        <w:continuationSeparator/>
+      </w:r>
+    </w:p>
+  </w:endnote>
+</w:endnotes>
+</file>
+
+<file path=word/footnotes.xml><?xml version="1.0" encoding="utf-8"?>
+<w:footnotes xmlns:wpc="http://schemas.microsoft.com/office/word/2010/wordprocessingCanvas" xmlns:cx="http://schemas.microsoft.com/office/drawing/2014/chartex" xmlns:cx1="http://schemas.microsoft.com/office/drawing/2015/9/8/chartex" xmlns:cx2="http://schemas.microsoft.com/office/drawing/2015/10/21/chartex" xmlns:cx3="http://schemas.microsoft.com/office/drawing/2016/5/9/chartex" xmlns:cx4="http://schemas.microsoft.com/office/drawing/2016/5/10/chartex" xmlns:cx5="http://schemas.microsoft.com/office/drawing/2016/5/11/chartex" xmlns:cx6="http://schemas.microsoft.com/office/drawing/2016/5/12/chartex" xmlns:cx7="http://schemas.microsoft.com/office/drawing/2016/5/13/chartex" xmlns:cx8="http://schemas.microsoft.com/office/drawing/2016/5/14/chartex" xmlns:mc="http://schemas.openxmlformats.org/markup-compatibility/2006" xmlns:aink="http://schemas.microsoft.com/office/drawing/2016/ink" xmlns:am3d="http://schemas.microsoft.com/office/drawing/2017/model3d" xmlns:o="urn:schemas-microsoft-com:office:office" xmlns:oel="http://schemas.microsoft.com/office/2019/extlst" xmlns:r="http://schemas.openxmlformats.org/officeDocument/2006/relationships" xmlns:m="http://schemas.openxmlformats.org/officeDocument/2006/math" xmlns:v="urn:schemas-microsoft-com:vml" xmlns:wp14="http://schemas.microsoft.com/office/word/2010/wordprocessingDrawing" xmlns:wp="http://schemas.openxmlformats.org/drawingml/2006/wordprocessingDrawing" xmlns:w10="urn:schemas-microsoft-com:office:word" xmlns:w="http://schemas.openxmlformats.org/wordprocessingml/2006/main" xmlns:w14="http://schemas.microsoft.com/office/word/2010/wordml" xmlns:w15="http://schemas.microsoft.com/office/word/2012/wordml" xmlns:w16cex="http://schemas.microsoft.com/office/word/2018/wordml/cex" xmlns:w16cid="http://schemas.microsoft.com/office/word/2016/wordml/cid" xmlns:w16="http://schemas.microsoft.com/office/word/2018/wordml" xmlns:w16du="http://schemas.microsoft.com/office/word/2023/wordml/word16du" xmlns:w16sdtdh="http://schemas.microsoft.com/office/word/2020/wordml/sdtdatahash" xmlns:w16sdtfl="http://schemas.microsoft.com/office/word/2024/wordml/sdtformatlock" xmlns:w16se="http://schemas.microsoft.com/office/word/2015/wordml/symex" xmlns:wpg="http://schemas.microsoft.com/office/word/2010/wordprocessingGroup" xmlns:wpi="http://schemas.microsoft.com/office/word/2010/wordprocessingInk" xmlns:wne="http://schemas.microsoft.com/office/word/2006/wordml" xmlns:wps="http://schemas.microsoft.com/office/word/2010/wordprocessingShape" mc:Ignorable="w14 w15 w16se w16cid w16 w16cex w16sdtdh w16sdtfl w16du wp14">
+  <w:footnote w:type="separator" w:id="-1">
+    <w:p>
+      <w:pPr>
+        <w:spacing w:line="240" w:lineRule="auto"/>
+      </w:pPr>
+      <w:r>
+        <w:separator/>
+      </w:r>
+    </w:p>
+  </w:footnote>
+  <w:footnote w:type="continuationSeparator" w:id="0">
+    <w:p>
+      <w:pPr>
+        <w:spacing w:line="240" w:lineRule="auto"/>
+      </w:pPr>
+      <w:r>
+        <w:continuationSeparator/>
+      </w:r>
+    </w:p>
+  </w:footnote>
+</w:footnotes>
 </file>
 
 <file path=word/numbering.xml><?xml version="1.0" encoding="utf-8"?>
@@ -3982,6 +3558,50 @@
       <w:ind w:leftChars="400" w:left="800"/>
     </w:pPr>
   </w:style>
+  <w:style w:type="paragraph" w:styleId="affffffc">
+    <w:name w:val="header"/>
+    <w:basedOn w:val="a"/>
+    <w:link w:val="Char"/>
+    <w:uiPriority w:val="99"/>
+    <w:unhideWhenUsed/>
+    <w:rsid w:val="00447D26"/>
+    <w:pPr>
+      <w:tabs>
+        <w:tab w:val="center" w:pos="4513"/>
+        <w:tab w:val="right" w:pos="9026"/>
+      </w:tabs>
+      <w:snapToGrid w:val="0"/>
+    </w:pPr>
+  </w:style>
+  <w:style w:type="character" w:customStyle="1" w:styleId="Char">
+    <w:name w:val="머리글 Char"/>
+    <w:basedOn w:val="a0"/>
+    <w:link w:val="affffffc"/>
+    <w:uiPriority w:val="99"/>
+    <w:rsid w:val="00447D26"/>
+  </w:style>
+  <w:style w:type="paragraph" w:styleId="affffffd">
+    <w:name w:val="footer"/>
+    <w:basedOn w:val="a"/>
+    <w:link w:val="Char0"/>
+    <w:uiPriority w:val="99"/>
+    <w:unhideWhenUsed/>
+    <w:rsid w:val="00447D26"/>
+    <w:pPr>
+      <w:tabs>
+        <w:tab w:val="center" w:pos="4513"/>
+        <w:tab w:val="right" w:pos="9026"/>
+      </w:tabs>
+      <w:snapToGrid w:val="0"/>
+    </w:pPr>
+  </w:style>
+  <w:style w:type="character" w:customStyle="1" w:styleId="Char0">
+    <w:name w:val="바닥글 Char"/>
+    <w:basedOn w:val="a0"/>
+    <w:link w:val="affffffd"/>
+    <w:uiPriority w:val="99"/>
+    <w:rsid w:val="00447D26"/>
+  </w:style>
 </w:styles>
 </file>
 

</xml_diff>